<commit_message>
Add script to audit and summarize no-LOS execution benchmark results
- Introduced `summarize_pstmo_no_los_execution.py` to load, validate, and summarize execution records from multiple environments.
- Implemented functionality to generate both CSV and JSON outputs for detailed analysis.
- Included checks for planner type, method consistency, and execution success criteria.
- Calculated aggregate statistics and comparisons for different methods, focusing on the PSTMO method.
</commit_message>
<xml_diff>
--- a/abstract/ICEEIS_2026_PSTMO_HIERARCHICAL_ALPHA_ABSTRACT_EN.docx
+++ b/abstract/ICEEIS_2026_PSTMO_HIERARCHICAL_ALPHA_ABSTRACT_EN.docx
@@ -12,7 +12,7 @@
           <w:b w:val="0"/>
           <w:i w:val="0"/>
         </w:rPr>
-        <w:t>Corridor-Preserving Path Smoothing and Turning-Maneuver Optimization for Differential-Drive Mobile Robots</w:t>
+        <w:t>Path Smoothing and Turning-Maneuver Optimization for Differential-Drive Mobile Robots</w:t>
       </w:r>
     </w:p>
     <w:p>
@@ -46,7 +46,7 @@
           <w:b w:val="0"/>
           <w:i w:val="0"/>
         </w:rPr>
-        <w:t xml:space="preserve">Global planners in ROS 2/Nav2 commonly produce piecewise-linear paths with abrupt heading changes, resulting in high curvature peaks and reduced motion continuity for differential-drive mobile robots. This paper proposes PSTMO, a path-smoothing and turning-maneuver optimization method. In contrast to greedy line-of-sight shortcuts, which may remove anchors that encode the planner corridor and approach direction, standalone PSTMO does not execute LOS. The planner path is first conditioned under bounded-deviation and swept-footprint constraints, after which only local corner regions are modified. At each corner, the method derives at most two geometrically grounded trim distances </w:t>
+        <w:t xml:space="preserve">Global planners in ROS 2/Nav2 commonly produce piecewise-linear paths with abrupt heading changes, resulting in high curvature peaks and reduced motion continuity for differential-drive mobile robots. This paper proposes PSTMO, a path-smoothing and turning-maneuver optimization method. In contrast to greedy line-of-sight shortcuts, which may remove anchors that encode important path features and the intended approach direction, standalone PSTMO does not execute LOS. The planner path is first conditioned under bounded-deviation and swept-footprint constraints, after which only local corner regions are modified. At each corner, the method derives at most two geometrically grounded trim distances </w:t>
       </w:r>
       <w:r>
         <w:rPr>
@@ -123,23 +123,20 @@
           <w:b w:val="0"/>
           <w:i w:val="0"/>
         </w:rPr>
-        <w:t xml:space="preserve">The evaluation contains 175 records from 7 Gazebo environments, 5 global planners, and 5 alternatives: Raw, Simple, Savitzky–Golay, Constrained, and PSTMO. Within each case, all alternatives receive the same Raw path. PSTMO returned a valid output in all 35/35 calls, executed exactly one </w:t>
+        <w:t>The geometric evaluation contains 175 records from 7 Gazebo environments and 5 global planners: NavFn A*, NavFn Dijkstra, Theta*, Smac 2D, and Smac Hybrid. Five alternatives are evaluated: Raw, Simple, Savitzky–Golay, Constrained, and PSTMO. Within each case, all alternatives receive the same Raw path. PSTMO returned a valid output in all 35/35 calls, passed the final safety checks, and produced no footprint-collision samples. Raw, Savitzky–Golay, and Constrained also succeeded in 35/35 cases, whereas Simple succeeded in 34/35. Across the 34 cases completed by all five alternatives, PSTMO achieved a mean path length of 10.1766 m, maximum curvature of 2.4047 m⁻¹, and squared-curvature integral of 3.3121 m⁻¹. Relative to Simple, which attained the lowest mean baseline value for all three corresponding metrics, these quantities decreased by 0.64%, 75.29%, and 81.44%, respectively. Relative to Constrained, maximum curvature and squared-curvature integral decreased by 80.62% and 92.10%.</w:t>
       </w:r>
+    </w:p>
+    <w:p>
+      <w:pPr>
+        <w:widowControl/>
+      </w:pPr>
       <w:r>
         <w:rPr>
           <w:rFonts w:ascii="Times New Roman" w:hAnsi="Times New Roman" w:eastAsia="Times New Roman"/>
           <w:b w:val="0"/>
           <w:i w:val="0"/>
         </w:rPr>
-        <w:t>condition_only</w:t>
-      </w:r>
-      <w:r>
-        <w:rPr>
-          <w:rFonts w:ascii="Times New Roman" w:hAnsi="Times New Roman" w:eastAsia="Times New Roman"/>
-          <w:b w:val="0"/>
-          <w:i w:val="0"/>
-        </w:rPr>
-        <w:t xml:space="preserve"> pipeline without LOS, passed the final invariant checks, and produced no footprint-collision samples. Raw, Savitzky–Golay, and Constrained also succeeded in 35/35 cases, whereas Simple succeeded in 34/35. Across the 34 cases completed by all five alternatives, PSTMO achieved a mean path length of 10.1766 m, maximum curvature of 2.4047 m⁻¹, and curvature energy of 3.3121 m⁻¹. Relative to Simple, which attained the lowest mean ROS 2 baseline value for each corresponding metric, these quantities decreased by 0.64%, 75.29%, and 81.44%, respectively. Relative to Constrained, maximum curvature and curvature energy decreased by 80.62% and 92.10%. PSTMO generated 221 G² transitions and 6 pivots over 229 corners, with a mean minimum footprint clearance of 0.1708 m. The trade-off was a mean smoothing time of 95.21 ms, compared with 22.59 ms for Constrained. The results demonstrate the geometric effectiveness and footprint validity of corridor-preserving PSTMO; closed-loop goal-reaching performance remains to be quantified in execution and hardware experiments.</w:t>
+        <w:t>Travel time was measured in a separate closed-loop experiment over the same 7 environments using Theta*. Each alternative was executed once per environment in a fresh simulation, from the same start pose to the same goal. Time was measured from controller path acceptance until the robot reached the goal and physically settled according to Gazebo ground truth. All 35/35 executions reached the goal without collision-monitor intervention. Mean travel times for Raw, Simple, Savitzky–Golay, Constrained, and PSTMO were 60.465 s, 55.635 s, 59.005 s, 60.545 s, and 55.813 s, respectively. PSTMO reduced mean travel time by 7.69% relative to Raw, 5.41% relative to Savitzky–Golay, and 7.82% relative to Constrained, while being 0.32% slower than Simple. These results show that PSTMO produces short, low-curvature paths while retaining near-best travel time. Repeated trials with additional planners and physical hardware remain future work.</w:t>
       </w:r>
     </w:p>
     <w:p>
@@ -160,7 +157,7 @@
           <w:b w:val="0"/>
           <w:i w:val="0"/>
         </w:rPr>
-        <w:t>PSTMO; differential-drive mobile robot; corridor-preserving path smoothing; G² Bézier transition; coarse-to-fine search; swept footprint; ROS 2/Nav2.</w:t>
+        <w:t>PSTMO; differential-drive mobile robot; path smoothing; turning-maneuver optimization; G² Bézier transition; coarse-to-fine search; swept footprint; ROS 2/Nav2.</w:t>
       </w:r>
     </w:p>
     <w:sectPr>

</xml_diff>

<commit_message>
Publish audited PSTMO benchmark report
</commit_message>
<xml_diff>
--- a/abstract/ICEEIS_2026_PSTMO_HIERARCHICAL_ALPHA_ABSTRACT_EN.docx
+++ b/abstract/ICEEIS_2026_PSTMO_HIERARCHICAL_ALPHA_ABSTRACT_EN.docx
@@ -46,97 +46,7 @@
           <w:b w:val="0"/>
           <w:i w:val="0"/>
         </w:rPr>
-        <w:t xml:space="preserve">Global planners in ROS 2/Nav2 commonly produce piecewise-linear paths with abrupt heading changes, resulting in high curvature peaks and reduced motion continuity for differential-drive mobile robots. This paper proposes PSTMO, a path-smoothing and turning-maneuver optimization method. In contrast to greedy line-of-sight shortcuts, which may remove anchors that encode important path features and the intended approach direction, standalone PSTMO does not execute LOS. The planner path is first conditioned under bounded-deviation and swept-footprint constraints, after which only local corner regions are modified. At each corner, the method derives at most two geometrically grounded trim distances </w:t>
-      </w:r>
-      <w:r>
-        <w:rPr>
-          <w:rFonts w:ascii="Times New Roman" w:hAnsi="Times New Roman" w:eastAsia="Times New Roman"/>
-          <w:b w:val="0"/>
-          <w:i/>
-        </w:rPr>
-        <w:t>d</w:t>
-      </w:r>
-      <w:r>
-        <w:rPr>
-          <w:rFonts w:ascii="Times New Roman" w:hAnsi="Times New Roman" w:eastAsia="Times New Roman"/>
-          <w:b w:val="0"/>
-          <w:i w:val="0"/>
-        </w:rPr>
-        <w:t xml:space="preserve">: a preferred value based on the adjacent edge lengths and a compatibility value that reserves at most half of the usable shared segment after a margin. For each </w:t>
-      </w:r>
-      <w:r>
-        <w:rPr>
-          <w:rFonts w:ascii="Times New Roman" w:hAnsi="Times New Roman" w:eastAsia="Times New Roman"/>
-          <w:b w:val="0"/>
-          <w:i/>
-        </w:rPr>
-        <w:t>d</w:t>
-      </w:r>
-      <w:r>
-        <w:rPr>
-          <w:rFonts w:ascii="Times New Roman" w:hAnsi="Times New Roman" w:eastAsia="Times New Roman"/>
-          <w:b w:val="0"/>
-          <w:i w:val="0"/>
-        </w:rPr>
-        <w:t>, the dimensionless ratio α=</w:t>
-      </w:r>
-      <w:r>
-        <w:rPr>
-          <w:rFonts w:ascii="Times New Roman" w:hAnsi="Times New Roman" w:eastAsia="Times New Roman"/>
-          <w:b w:val="0"/>
-          <w:i/>
-        </w:rPr>
-        <w:t>q</w:t>
-      </w:r>
-      <w:r>
-        <w:rPr>
-          <w:rFonts w:ascii="Times New Roman" w:hAnsi="Times New Roman" w:eastAsia="Times New Roman"/>
-          <w:b w:val="0"/>
-          <w:i w:val="0"/>
-        </w:rPr>
-        <w:t>/</w:t>
-      </w:r>
-      <w:r>
-        <w:rPr>
-          <w:rFonts w:ascii="Times New Roman" w:hAnsi="Times New Roman" w:eastAsia="Times New Roman"/>
-          <w:b w:val="0"/>
-          <w:i/>
-        </w:rPr>
-        <w:t>d</w:t>
-      </w:r>
-      <w:r>
-        <w:rPr>
-          <w:rFonts w:ascii="Times New Roman" w:hAnsi="Times New Roman" w:eastAsia="Times New Roman"/>
-          <w:b w:val="0"/>
-          <w:i w:val="0"/>
-        </w:rPr>
-        <w:t xml:space="preserve"> is searched on a coarse grid from 0.1 to 0.5, refined between the neighbors of the winning sample, and recovered using a half-step grid only when all coarse samples fail. A quintic G² Bézier transition is admitted only if it satisfies geometric validity, non-reversing inner-wheel motion, kinematic limits, timing constraints, and true swept-footprint collision checks. A time gate and dynamic programming then select among transitions and in-place rotations while rejecting states whose trims overlap on a shared segment.</w:t>
-      </w:r>
-    </w:p>
-    <w:p>
-      <w:pPr>
-        <w:widowControl/>
-      </w:pPr>
-      <w:r>
-        <w:rPr>
-          <w:rFonts w:ascii="Times New Roman" w:hAnsi="Times New Roman" w:eastAsia="Times New Roman"/>
-          <w:b w:val="0"/>
-          <w:i w:val="0"/>
-        </w:rPr>
-        <w:t>The geometric evaluation contains 175 records from 7 Gazebo environments and 5 global planners: NavFn A*, NavFn Dijkstra, Theta*, Smac 2D, and Smac Hybrid. Five alternatives are evaluated: Raw, Simple, Savitzky–Golay, Constrained, and PSTMO. Within each case, all alternatives receive the same Raw path. PSTMO returned a valid output in all 35/35 calls, passed the final safety checks, and produced no footprint-collision samples. Raw, Savitzky–Golay, and Constrained also succeeded in 35/35 cases, whereas Simple succeeded in 34/35. Across the 34 cases completed by all five alternatives, PSTMO achieved a mean path length of 10.1766 m, maximum curvature of 2.4047 m⁻¹, and squared-curvature integral of 3.3121 m⁻¹. Relative to Simple, which attained the lowest mean baseline value for all three corresponding metrics, these quantities decreased by 0.64%, 75.29%, and 81.44%, respectively. Relative to Constrained, maximum curvature and squared-curvature integral decreased by 80.62% and 92.10%.</w:t>
-      </w:r>
-    </w:p>
-    <w:p>
-      <w:pPr>
-        <w:widowControl/>
-      </w:pPr>
-      <w:r>
-        <w:rPr>
-          <w:rFonts w:ascii="Times New Roman" w:hAnsi="Times New Roman" w:eastAsia="Times New Roman"/>
-          <w:b w:val="0"/>
-          <w:i w:val="0"/>
-        </w:rPr>
-        <w:t>Travel time was measured in a separate closed-loop experiment over the same 7 environments using Theta*. Each alternative was executed once per environment in a fresh simulation, from the same start pose to the same goal. Time was measured from controller path acceptance until the robot reached the goal and physically settled according to Gazebo ground truth. All 35/35 executions reached the goal without collision-monitor intervention. Mean travel times for Raw, Simple, Savitzky–Golay, Constrained, and PSTMO were 60.465 s, 55.635 s, 59.005 s, 60.545 s, and 55.813 s, respectively. PSTMO reduced mean travel time by 7.69% relative to Raw, 5.41% relative to Savitzky–Golay, and 7.82% relative to Constrained, while being 0.32% slower than Simple. These results show that PSTMO produces short, low-curvature paths while retaining near-best travel time. Repeated trials with additional planners and physical hardware remain future work.</w:t>
+        <w:t>Global planners in ROS 2/Nav2 often produce piecewise-linear paths with sharp heading changes that slow differential-drive robots or require in-place rotations. This paper proposes Path Smoothing and Turning-Maneuver Optimization (PSTMO), a post-processing method that conditions the input path, constructs quintic Bézier transitions from two geometry-based trimming distances, rejects candidates violating kinematic, timing, or swept-footprint constraints, and uses dynamic programming to select compatible transitions and rotations. Evaluation in seven Gazebo environments used NavFn A*, NavFn Dijkstra, Theta*, Smac 2D, and Smac Hybrid, with Raw, Simple, Savitzky–Golay, and Constrained as baselines. In 34 complete planning comparisons, PSTMO reduced mean path length, maximum curvature, and squared-curvature integral by 0.64%, 75.29%, and 81.44% relative to Simple. Closed-loop evaluation comprised 175 isolated runs. All five methods completed 34 of 35 planner–environment cases; the shared failure was Smac Hybrid in Warehouse Dispatch. Across successful paired cases, mean travel times were 57.120, 54.449, 56.677, 57.293, and 53.148 s for Raw, Simple, Savitzky–Golay, Constrained, and PSTMO. Thus, 170 runs reached the goal without collision-monitor intervention, while PSTMO achieved the lowest mean travel time and substantially reduced turning severity.</w:t>
       </w:r>
     </w:p>
     <w:p>
@@ -157,11 +67,10 @@
           <w:b w:val="0"/>
           <w:i w:val="0"/>
         </w:rPr>
-        <w:t>PSTMO; differential-drive mobile robot; path smoothing; turning-maneuver optimization; G² Bézier transition; coarse-to-fine search; swept footprint; ROS 2/Nav2.</w:t>
+        <w:t>differential-drive mobile robot; path smoothing; turning-maneuver optimization; Bézier transition; ROS 2/Nav2.</w:t>
       </w:r>
     </w:p>
     <w:sectPr>
-      <w:footerReference w:type="default" r:id="rId9"/>
       <w:pgSz w:w="11906" w:h="16838"/>
       <w:pgMar w:top="1077" w:right="1020" w:bottom="1077" w:left="1020" w:header="397" w:footer="454" w:gutter="0"/>
       <w:cols w:space="360" w:num="1"/>
@@ -169,24 +78,6 @@
     </w:sectPr>
   </w:body>
 </w:document>
-</file>
-
-<file path=word/footer1.xml><?xml version="1.0" encoding="utf-8"?>
-<w:ftr xmlns:m="http://schemas.openxmlformats.org/officeDocument/2006/math" xmlns:mc="http://schemas.openxmlformats.org/markup-compatibility/2006" xmlns:mo="http://schemas.microsoft.com/office/mac/office/2008/main" xmlns:mv="urn:schemas-microsoft-com:mac:vml" xmlns:o="urn:schemas-microsoft-com:office:office" xmlns:r="http://schemas.openxmlformats.org/officeDocument/2006/relationships" xmlns:v="urn:schemas-microsoft-com:vml" xmlns:w10="urn:schemas-microsoft-com:office:word" xmlns:w14="http://schemas.microsoft.com/office/word/2010/wordml" xmlns:w="http://schemas.openxmlformats.org/wordprocessingml/2006/main" xmlns:wne="http://schemas.microsoft.com/office/word/2006/wordml" xmlns:wp14="http://schemas.microsoft.com/office/word/2010/wordprocessingDrawing" xmlns:wp="http://schemas.openxmlformats.org/drawingml/2006/wordprocessingDrawing" xmlns:wpc="http://schemas.microsoft.com/office/word/2010/wordprocessingCanvas" xmlns:wpg="http://schemas.microsoft.com/office/word/2010/wordprocessingGroup" xmlns:wpi="http://schemas.microsoft.com/office/word/2010/wordprocessingInk" xmlns:wps="http://schemas.microsoft.com/office/word/2010/wordprocessingShape" mc:Ignorable="w14 wp14">
-  <w:p>
-    <w:pPr>
-      <w:pStyle w:val="Footer"/>
-      <w:jc w:val="center"/>
-    </w:pPr>
-    <w:r>
-      <w:fldChar w:fldCharType="begin"/>
-      <w:instrText xml:space="preserve"> PAGE </w:instrText>
-      <w:fldChar w:fldCharType="separate"/>
-      <w:t>1</w:t>
-      <w:fldChar w:fldCharType="end"/>
-    </w:r>
-  </w:p>
-</w:ftr>
 </file>
 
 <file path=word/numbering.xml><?xml version="1.0" encoding="utf-8"?>

</xml_diff>